<commit_message>
Adicinando um resumo em formato docx para a empresa Nós  3D
</commit_message>
<xml_diff>
--- a/docs/Levantamento_De_Requisitos_Iniciais.docx
+++ b/docs/Levantamento_De_Requisitos_Iniciais.docx
@@ -305,6 +305,7 @@
           <w:bCs/>
         </w:rPr>
       </w:pPr>
+      <w:commentRangeStart w:id="0"/>
       <w:r>
         <w:rPr>
           <w:rFonts w:ascii="Montserrat" w:hAnsi="Montserrat"/>
@@ -334,80 +335,6 @@
           <w:rFonts w:ascii="Montserrat" w:hAnsi="Montserrat"/>
         </w:rPr>
         <w:t>Sim. A empresa possui computador e acesso à internet, possibilitando o acesso e utilização do site/catálogo.</w:t>
-      </w:r>
-    </w:p>
-    <w:p>
-      <w:pPr>
-        <w:jc w:val="both"/>
-        <w:rPr>
-          <w:rFonts w:ascii="Montserrat" w:hAnsi="Montserrat"/>
-        </w:rPr>
-      </w:pPr>
-    </w:p>
-    <w:p>
-      <w:pPr>
-        <w:jc w:val="both"/>
-        <w:rPr>
-          <w:rFonts w:ascii="Montserrat" w:hAnsi="Montserrat"/>
-        </w:rPr>
-      </w:pPr>
-    </w:p>
-    <w:p>
-      <w:pPr>
-        <w:jc w:val="both"/>
-        <w:rPr>
-          <w:rFonts w:ascii="Montserrat" w:hAnsi="Montserrat"/>
-        </w:rPr>
-      </w:pPr>
-    </w:p>
-    <w:p>
-      <w:pPr>
-        <w:jc w:val="both"/>
-        <w:rPr>
-          <w:rFonts w:ascii="Montserrat" w:hAnsi="Montserrat"/>
-        </w:rPr>
-      </w:pPr>
-    </w:p>
-    <w:p>
-      <w:pPr>
-        <w:jc w:val="both"/>
-        <w:rPr>
-          <w:rFonts w:ascii="Montserrat" w:hAnsi="Montserrat"/>
-          <w:b/>
-          <w:bCs/>
-        </w:rPr>
-      </w:pPr>
-      <w:r>
-        <w:rPr>
-          <w:rFonts w:ascii="Montserrat" w:hAnsi="Montserrat"/>
-          <w:b/>
-          <w:bCs/>
-        </w:rPr>
-        <w:t xml:space="preserve">-  </w:t>
-      </w:r>
-      <w:commentRangeStart w:id="0"/>
-      <w:r>
-        <w:rPr>
-          <w:rFonts w:ascii="Montserrat" w:hAnsi="Montserrat"/>
-          <w:b/>
-          <w:bCs/>
-        </w:rPr>
-        <w:t>7. A empresa possui conhecimentos tecnológicos para uso do site/catálogo?</w:t>
-      </w:r>
-    </w:p>
-    <w:p>
-      <w:pPr>
-        <w:jc w:val="both"/>
-        <w:rPr>
-          <w:rFonts w:ascii="Montserrat" w:hAnsi="Montserrat"/>
-        </w:rPr>
-      </w:pPr>
-      <w:r>
-        <w:rPr>
-          <w:rFonts w:ascii="Montserrat" w:hAnsi="Montserrat"/>
-        </w:rPr>
-        <w:lastRenderedPageBreak/>
-        <w:t>Sim. A empresa possui conhecimentos tecnológicos necessários para utilizar o site/catálogo e seus recursos, podendo realizar o acesso e a utilização do sistema de forma adequada.</w:t>
       </w:r>
       <w:commentRangeEnd w:id="0"/>
       <w:r>
@@ -419,6 +346,14 @@
         </w:rPr>
         <w:commentReference w:id="0"/>
       </w:r>
+    </w:p>
+    <w:p>
+      <w:pPr>
+        <w:jc w:val="both"/>
+        <w:rPr>
+          <w:rFonts w:ascii="Montserrat" w:hAnsi="Montserrat"/>
+        </w:rPr>
+      </w:pPr>
     </w:p>
     <w:p>
       <w:pPr>
@@ -449,7 +384,144 @@
         <w:rPr>
           <w:rFonts w:ascii="Montserrat" w:hAnsi="Montserrat"/>
         </w:rPr>
-        <w:t xml:space="preserve">Quais são esses conhecimentos </w:t>
+        <w:t xml:space="preserve">Quais são esses </w:t>
+      </w:r>
+      <w:r>
+        <w:rPr>
+          <w:rFonts w:ascii="Montserrat" w:hAnsi="Montserrat"/>
+        </w:rPr>
+        <w:t>meios</w:t>
+      </w:r>
+      <w:r>
+        <w:rPr>
+          <w:rFonts w:ascii="Montserrat" w:hAnsi="Montserrat"/>
+        </w:rPr>
+        <w:t xml:space="preserve"> </w:t>
+      </w:r>
+      <w:r>
+        <w:rPr>
+          <w:rFonts w:ascii="Montserrat" w:hAnsi="Montserrat"/>
+        </w:rPr>
+        <w:t>?</w:t>
+      </w:r>
+    </w:p>
+    <w:p>
+      <w:pPr>
+        <w:jc w:val="both"/>
+        <w:rPr>
+          <w:rFonts w:ascii="Montserrat" w:hAnsi="Montserrat"/>
+        </w:rPr>
+      </w:pPr>
+      <w:r>
+        <w:rPr>
+          <w:rFonts w:ascii="Montserrat" w:hAnsi="Montserrat"/>
+        </w:rPr>
+        <w:t>-</w:t>
+      </w:r>
+      <w:r>
+        <w:rPr>
+          <w:rFonts w:ascii="Montserrat" w:hAnsi="Montserrat"/>
+        </w:rPr>
+        <w:t xml:space="preserve"> Mapeamento de toda a arquitetura utilizada pela empresa desde o momento do contato com o cliente até a finalização do pedido</w:t>
+      </w:r>
+      <w:r>
+        <w:rPr>
+          <w:rFonts w:ascii="Montserrat" w:hAnsi="Montserrat"/>
+        </w:rPr>
+        <w:t>. Isso inclui: Softwares utilizados, arquitetura e especificações dos Computadores que são utilizados.</w:t>
+      </w:r>
+    </w:p>
+    <w:p>
+      <w:pPr>
+        <w:jc w:val="both"/>
+        <w:rPr>
+          <w:rFonts w:ascii="Montserrat" w:hAnsi="Montserrat"/>
+        </w:rPr>
+      </w:pPr>
+    </w:p>
+    <w:p>
+      <w:pPr>
+        <w:jc w:val="both"/>
+        <w:rPr>
+          <w:rFonts w:ascii="Montserrat" w:hAnsi="Montserrat"/>
+          <w:b/>
+          <w:bCs/>
+        </w:rPr>
+      </w:pPr>
+      <w:r>
+        <w:rPr>
+          <w:rFonts w:ascii="Montserrat" w:hAnsi="Montserrat"/>
+          <w:b/>
+          <w:bCs/>
+        </w:rPr>
+        <w:lastRenderedPageBreak/>
+        <w:t xml:space="preserve">-  </w:t>
+      </w:r>
+      <w:r>
+        <w:rPr>
+          <w:rFonts w:ascii="Montserrat" w:hAnsi="Montserrat"/>
+          <w:b/>
+          <w:bCs/>
+        </w:rPr>
+        <w:t>7. A empresa possui conhecimentos tecnológicos para uso do site/catálogo?</w:t>
+      </w:r>
+    </w:p>
+    <w:p>
+      <w:pPr>
+        <w:jc w:val="both"/>
+        <w:rPr>
+          <w:rFonts w:ascii="Montserrat" w:hAnsi="Montserrat"/>
+        </w:rPr>
+      </w:pPr>
+      <w:r>
+        <w:rPr>
+          <w:rFonts w:ascii="Montserrat" w:hAnsi="Montserrat"/>
+        </w:rPr>
+        <w:t>Sim. A empresa possui conhecimentos tecnológicos necessários para utilizar o site/catálogo e seus recursos, podendo realizar o acesso e a utilização do sistema de forma adequada.</w:t>
+      </w:r>
+    </w:p>
+    <w:p>
+      <w:pPr>
+        <w:ind w:firstLine="708"/>
+        <w:jc w:val="both"/>
+        <w:rPr>
+          <w:rFonts w:ascii="Montserrat" w:hAnsi="Montserrat"/>
+        </w:rPr>
+      </w:pPr>
+      <w:r>
+        <w:rPr>
+          <w:rFonts w:ascii="Montserrat" w:hAnsi="Montserrat"/>
+        </w:rPr>
+        <w:t>-</w:t>
+      </w:r>
+      <w:r>
+        <w:rPr>
+          <w:rFonts w:ascii="Segoe UI" w:eastAsia="Times New Roman" w:hAnsi="Segoe UI" w:cs="Segoe UI"/>
+          <w:kern w:val="0"/>
+          <w:sz w:val="18"/>
+          <w:szCs w:val="18"/>
+          <w:lang w:eastAsia="pt-BR"/>
+          <w14:ligatures w14:val="none"/>
+        </w:rPr>
+        <w:t xml:space="preserve"> </w:t>
+      </w:r>
+      <w:r>
+        <w:rPr>
+          <w:rFonts w:ascii="Montserrat" w:hAnsi="Montserrat"/>
+        </w:rPr>
+        <w:t xml:space="preserve">Quais são esses </w:t>
+      </w:r>
+      <w:r>
+        <w:rPr>
+          <w:rFonts w:ascii="Montserrat" w:hAnsi="Montserrat"/>
+        </w:rPr>
+        <w:t>meios</w:t>
+      </w:r>
+      <w:r>
+        <w:rPr>
+          <w:rFonts w:ascii="Montserrat" w:hAnsi="Montserrat"/>
+        </w:rPr>
+        <w:t xml:space="preserve"> </w:t>
       </w:r>
       <w:r>
         <w:rPr>
@@ -536,7 +608,7 @@
 
 <file path=word/comments.xml><?xml version="1.0" encoding="utf-8"?>
 <w:comments xmlns:wpc="http://schemas.microsoft.com/office/word/2010/wordprocessingCanvas" xmlns:cx="http://schemas.microsoft.com/office/drawing/2014/chartex" xmlns:cx1="http://schemas.microsoft.com/office/drawing/2015/9/8/chartex" xmlns:cx2="http://schemas.microsoft.com/office/drawing/2015/10/21/chartex" xmlns:cx3="http://schemas.microsoft.com/office/drawing/2016/5/9/chartex" xmlns:cx4="http://schemas.microsoft.com/office/drawing/2016/5/10/chartex" xmlns:cx5="http://schemas.microsoft.com/office/drawing/2016/5/11/chartex" xmlns:cx6="http://schemas.microsoft.com/office/drawing/2016/5/12/chartex" xmlns:cx7="http://schemas.microsoft.com/office/drawing/2016/5/13/chartex" xmlns:cx8="http://schemas.microsoft.com/office/drawing/2016/5/14/chartex" xmlns:mc="http://schemas.openxmlformats.org/markup-compatibility/2006" xmlns:aink="http://schemas.microsoft.com/office/drawing/2016/ink" xmlns:am3d="http://schemas.microsoft.com/office/drawing/2017/model3d" xmlns:o="urn:schemas-microsoft-com:office:office" xmlns:oel="http://schemas.microsoft.com/office/2019/extlst" xmlns:r="http://schemas.openxmlformats.org/officeDocument/2006/relationships" xmlns:m="http://schemas.openxmlformats.org/officeDocument/2006/math" xmlns:v="urn:schemas-microsoft-com:vml" xmlns:wp14="http://schemas.microsoft.com/office/word/2010/wordprocessingDrawing" xmlns:wp="http://schemas.openxmlformats.org/drawingml/2006/wordprocessingDrawing" xmlns:w10="urn:schemas-microsoft-com:office:word" xmlns:w="http://schemas.openxmlformats.org/wordprocessingml/2006/main" xmlns:w14="http://schemas.microsoft.com/office/word/2010/wordml" xmlns:w15="http://schemas.microsoft.com/office/word/2012/wordml" xmlns:w16cex="http://schemas.microsoft.com/office/word/2018/wordml/cex" xmlns:w16cid="http://schemas.microsoft.com/office/word/2016/wordml/cid" xmlns:w16="http://schemas.microsoft.com/office/word/2018/wordml" xmlns:w16du="http://schemas.microsoft.com/office/word/2023/wordml/word16du" xmlns:w16sdtdh="http://schemas.microsoft.com/office/word/2020/wordml/sdtdatahash" xmlns:w16sdtfl="http://schemas.microsoft.com/office/word/2024/wordml/sdtformatlock" xmlns:w16se="http://schemas.microsoft.com/office/word/2015/wordml/symex" xmlns:wpg="http://schemas.microsoft.com/office/word/2010/wordprocessingGroup" xmlns:wpi="http://schemas.microsoft.com/office/word/2010/wordprocessingInk" xmlns:wne="http://schemas.microsoft.com/office/word/2006/wordml" xmlns:wps="http://schemas.microsoft.com/office/word/2010/wordprocessingShape" mc:Ignorable="w14 w15 w16se w16cid w16 w16cex w16sdtdh w16sdtfl w16du wp14">
-  <w:comment w:id="0" w:author="Lucas Oliveira" w:date="2026-09-17T14:24:00Z" w:initials="LO">
+  <w:comment w:id="0" w:author="Lucas Oliveira" w:date="2026-09-17T14:28:00Z" w:initials="LO">
     <w:p>
       <w:pPr>
         <w:pStyle w:val="Textodecomentrio"/>
@@ -548,7 +620,7 @@
         <w:annotationRef/>
       </w:r>
       <w:r>
-        <w:t>Levantamento de Requisitos de Software e Arquitetura Computacional</w:t>
+        <w:t>Discussão de arquitetura de Computadores e infraestrutura Computacional</w:t>
       </w:r>
     </w:p>
   </w:comment>
@@ -557,19 +629,19 @@
 
 <file path=word/commentsExtended.xml><?xml version="1.0" encoding="utf-8"?>
 <w15:commentsEx xmlns:wpc="http://schemas.microsoft.com/office/word/2010/wordprocessingCanvas" xmlns:cx="http://schemas.microsoft.com/office/drawing/2014/chartex" xmlns:cx1="http://schemas.microsoft.com/office/drawing/2015/9/8/chartex" xmlns:cx2="http://schemas.microsoft.com/office/drawing/2015/10/21/chartex" xmlns:cx3="http://schemas.microsoft.com/office/drawing/2016/5/9/chartex" xmlns:cx4="http://schemas.microsoft.com/office/drawing/2016/5/10/chartex" xmlns:cx5="http://schemas.microsoft.com/office/drawing/2016/5/11/chartex" xmlns:cx6="http://schemas.microsoft.com/office/drawing/2016/5/12/chartex" xmlns:cx7="http://schemas.microsoft.com/office/drawing/2016/5/13/chartex" xmlns:cx8="http://schemas.microsoft.com/office/drawing/2016/5/14/chartex" xmlns:mc="http://schemas.openxmlformats.org/markup-compatibility/2006" xmlns:aink="http://schemas.microsoft.com/office/drawing/2016/ink" xmlns:am3d="http://schemas.microsoft.com/office/drawing/2017/model3d" xmlns:o="urn:schemas-microsoft-com:office:office" xmlns:oel="http://schemas.microsoft.com/office/2019/extlst" xmlns:r="http://schemas.openxmlformats.org/officeDocument/2006/relationships" xmlns:m="http://schemas.openxmlformats.org/officeDocument/2006/math" xmlns:v="urn:schemas-microsoft-com:vml" xmlns:wp14="http://schemas.microsoft.com/office/word/2010/wordprocessingDrawing" xmlns:wp="http://schemas.openxmlformats.org/drawingml/2006/wordprocessingDrawing" xmlns:w10="urn:schemas-microsoft-com:office:word" xmlns:w="http://schemas.openxmlformats.org/wordprocessingml/2006/main" xmlns:w14="http://schemas.microsoft.com/office/word/2010/wordml" xmlns:w15="http://schemas.microsoft.com/office/word/2012/wordml" xmlns:w16cex="http://schemas.microsoft.com/office/word/2018/wordml/cex" xmlns:w16cid="http://schemas.microsoft.com/office/word/2016/wordml/cid" xmlns:w16="http://schemas.microsoft.com/office/word/2018/wordml" xmlns:w16du="http://schemas.microsoft.com/office/word/2023/wordml/word16du" xmlns:w16sdtdh="http://schemas.microsoft.com/office/word/2020/wordml/sdtdatahash" xmlns:w16sdtfl="http://schemas.microsoft.com/office/word/2024/wordml/sdtformatlock" xmlns:w16se="http://schemas.microsoft.com/office/word/2015/wordml/symex" xmlns:wpg="http://schemas.microsoft.com/office/word/2010/wordprocessingGroup" xmlns:wpi="http://schemas.microsoft.com/office/word/2010/wordprocessingInk" xmlns:wne="http://schemas.microsoft.com/office/word/2006/wordml" xmlns:wps="http://schemas.microsoft.com/office/word/2010/wordprocessingShape" mc:Ignorable="w14 w15 w16se w16cid w16 w16cex w16sdtdh w16sdtfl w16du wp14">
-  <w15:commentEx w15:paraId="3133A7B7" w15:done="0"/>
+  <w15:commentEx w15:paraId="19A1F646" w15:done="0"/>
 </w15:commentsEx>
 </file>
 
 <file path=word/commentsExtensible.xml><?xml version="1.0" encoding="utf-8"?>
 <w16cex:commentsExtensible xmlns:wpc="http://schemas.microsoft.com/office/word/2010/wordprocessingCanvas" xmlns:cx="http://schemas.microsoft.com/office/drawing/2014/chartex" xmlns:cx1="http://schemas.microsoft.com/office/drawing/2015/9/8/chartex" xmlns:cx2="http://schemas.microsoft.com/office/drawing/2015/10/21/chartex" xmlns:cx3="http://schemas.microsoft.com/office/drawing/2016/5/9/chartex" xmlns:cx4="http://schemas.microsoft.com/office/drawing/2016/5/10/chartex" xmlns:cx5="http://schemas.microsoft.com/office/drawing/2016/5/11/chartex" xmlns:cx6="http://schemas.microsoft.com/office/drawing/2016/5/12/chartex" xmlns:cx7="http://schemas.microsoft.com/office/drawing/2016/5/13/chartex" xmlns:cx8="http://schemas.microsoft.com/office/drawing/2016/5/14/chartex" xmlns:cr="http://schemas.microsoft.com/office/comments/2020/reactions" xmlns:mc="http://schemas.openxmlformats.org/markup-compatibility/2006" xmlns:aink="http://schemas.microsoft.com/office/drawing/2016/ink" xmlns:am3d="http://schemas.microsoft.com/office/drawing/2017/model3d" xmlns:o="urn:schemas-microsoft-com:office:office" xmlns:oel="http://schemas.microsoft.com/office/2019/extlst" xmlns:r="http://schemas.openxmlformats.org/officeDocument/2006/relationships" xmlns:m="http://schemas.openxmlformats.org/officeDocument/2006/math" xmlns:v="urn:schemas-microsoft-com:vml" xmlns:wp14="http://schemas.microsoft.com/office/word/2010/wordprocessingDrawing" xmlns:wp="http://schemas.openxmlformats.org/drawingml/2006/wordprocessingDrawing" xmlns:w10="urn:schemas-microsoft-com:office:word" xmlns:w="http://schemas.openxmlformats.org/wordprocessingml/2006/main" xmlns:w14="http://schemas.microsoft.com/office/word/2010/wordml" xmlns:w15="http://schemas.microsoft.com/office/word/2012/wordml" xmlns:w16cex="http://schemas.microsoft.com/office/word/2018/wordml/cex" xmlns:w16cid="http://schemas.microsoft.com/office/word/2016/wordml/cid" xmlns:w16="http://schemas.microsoft.com/office/word/2018/wordml" xmlns:w16du="http://schemas.microsoft.com/office/word/2023/wordml/word16du" xmlns:w16sdtdh="http://schemas.microsoft.com/office/word/2020/wordml/sdtdatahash" xmlns:w16sdtfl="http://schemas.microsoft.com/office/word/2024/wordml/sdtformatlock" xmlns:w16se="http://schemas.microsoft.com/office/word/2015/wordml/symex" xmlns:wpg="http://schemas.microsoft.com/office/word/2010/wordprocessingGroup" xmlns:wpi="http://schemas.microsoft.com/office/word/2010/wordprocessingInk" xmlns:wne="http://schemas.microsoft.com/office/word/2006/wordml" xmlns:wps="http://schemas.microsoft.com/office/word/2010/wordprocessingShape" mc:Ignorable="w14 w15 w16se w16cid w16 w16cex w16sdtdh w16sdtfl cr w16du wp14">
-  <w16cex:commentExtensible w16cex:durableId="60BAD385" w16cex:dateUtc="2026-09-17T17:24:00Z"/>
+  <w16cex:commentExtensible w16cex:durableId="45E75D1C" w16cex:dateUtc="2026-09-17T17:28:00Z"/>
 </w16cex:commentsExtensible>
 </file>
 
 <file path=word/commentsIds.xml><?xml version="1.0" encoding="utf-8"?>
 <w16cid:commentsIds xmlns:wpc="http://schemas.microsoft.com/office/word/2010/wordprocessingCanvas" xmlns:cx="http://schemas.microsoft.com/office/drawing/2014/chartex" xmlns:cx1="http://schemas.microsoft.com/office/drawing/2015/9/8/chartex" xmlns:cx2="http://schemas.microsoft.com/office/drawing/2015/10/21/chartex" xmlns:cx3="http://schemas.microsoft.com/office/drawing/2016/5/9/chartex" xmlns:cx4="http://schemas.microsoft.com/office/drawing/2016/5/10/chartex" xmlns:cx5="http://schemas.microsoft.com/office/drawing/2016/5/11/chartex" xmlns:cx6="http://schemas.microsoft.com/office/drawing/2016/5/12/chartex" xmlns:cx7="http://schemas.microsoft.com/office/drawing/2016/5/13/chartex" xmlns:cx8="http://schemas.microsoft.com/office/drawing/2016/5/14/chartex" xmlns:mc="http://schemas.openxmlformats.org/markup-compatibility/2006" xmlns:aink="http://schemas.microsoft.com/office/drawing/2016/ink" xmlns:am3d="http://schemas.microsoft.com/office/drawing/2017/model3d" xmlns:o="urn:schemas-microsoft-com:office:office" xmlns:oel="http://schemas.microsoft.com/office/2019/extlst" xmlns:r="http://schemas.openxmlformats.org/officeDocument/2006/relationships" xmlns:m="http://schemas.openxmlformats.org/officeDocument/2006/math" xmlns:v="urn:schemas-microsoft-com:vml" xmlns:wp14="http://schemas.microsoft.com/office/word/2010/wordprocessingDrawing" xmlns:wp="http://schemas.openxmlformats.org/drawingml/2006/wordprocessingDrawing" xmlns:w10="urn:schemas-microsoft-com:office:word" xmlns:w="http://schemas.openxmlformats.org/wordprocessingml/2006/main" xmlns:w14="http://schemas.microsoft.com/office/word/2010/wordml" xmlns:w15="http://schemas.microsoft.com/office/word/2012/wordml" xmlns:w16cex="http://schemas.microsoft.com/office/word/2018/wordml/cex" xmlns:w16cid="http://schemas.microsoft.com/office/word/2016/wordml/cid" xmlns:w16="http://schemas.microsoft.com/office/word/2018/wordml" xmlns:w16du="http://schemas.microsoft.com/office/word/2023/wordml/word16du" xmlns:w16sdtdh="http://schemas.microsoft.com/office/word/2020/wordml/sdtdatahash" xmlns:w16sdtfl="http://schemas.microsoft.com/office/word/2024/wordml/sdtformatlock" xmlns:w16se="http://schemas.microsoft.com/office/word/2015/wordml/symex" xmlns:wpg="http://schemas.microsoft.com/office/word/2010/wordprocessingGroup" xmlns:wpi="http://schemas.microsoft.com/office/word/2010/wordprocessingInk" xmlns:wne="http://schemas.microsoft.com/office/word/2006/wordml" xmlns:wps="http://schemas.microsoft.com/office/word/2010/wordprocessingShape" mc:Ignorable="w14 w15 w16se w16cid w16 w16cex w16sdtdh w16sdtfl w16du wp14">
-  <w16cid:commentId w16cid:paraId="3133A7B7" w16cid:durableId="60BAD385"/>
+  <w16cid:commentId w16cid:paraId="19A1F646" w16cid:durableId="45E75D1C"/>
 </w16cid:commentsIds>
 </file>
 

</xml_diff>